<commit_message>
docs: actualizar documentos a la aplicacion en java
</commit_message>
<xml_diff>
--- a/documentos/fase2/01_Analisis_Seleccion_SO.docx
+++ b/documentos/fase2/01_Analisis_Seleccion_SO.docx
@@ -349,7 +349,7 @@
         <w:rPr>
           <w:lang w:val="es-CO"/>
         </w:rPr>
-        <w:t xml:space="preserve">SIGEVET es el Sistema Integral de Gestión Veterinaria de la organización ficticia Huella Sana S.A.S., una red de cinco clínicas en Usaquén, Chapinero, Chía, Laureles y San Fernando. Su modelo comprende 22 tablas para sedes, personal, propietarios, mascotas, atención clínica, inventarios y facturación. La aplicación web, desarrollada con Python y Flask, será exclusivamente de consulta. El alcance es un laboratorio académico virtualizado con datos sintéticos, sin compromisos de disponibilidad propios de una operación clínica real.</w:t>
+        <w:t xml:space="preserve">SIGEVET es el Sistema Integral de Gestión Veterinaria de la organización ficticia Huella Sana S.A.S., una red de cinco clínicas en Usaquén, Chapinero, Chía, Laureles y San Fernando. Su modelo comprende 22 tablas para sedes, personal, propietarios, mascotas, atención clínica, inventarios y facturación. La aplicación web, desarrollada en Java con Spring Boot, será exclusivamente de consulta. El alcance es un laboratorio académico virtualizado con datos sintéticos, sin compromisos de disponibilidad propios de una operación clínica real.</w:t>
       </w:r>
     </w:p>
     <w:p>
@@ -480,32 +480,7 @@
         <w:rPr>
           <w:lang w:val="es-CO"/>
         </w:rPr>
-        <w:t xml:space="preserve">. La conectividad desde la aplicación se realizará mediante</w:t>
-      </w:r>
-      <w:r>
-        <w:rPr>
-          <w:lang w:val="es-CO"/>
-        </w:rPr>
-        <w:t xml:space="preserve"> </w:t>
-      </w:r>
-      <w:r>
-        <w:rPr>
-          <w:rStyle w:val="VerbatimChar"/>
-          <w:lang w:val="es-CO"/>
-        </w:rPr>
-        <w:t xml:space="preserve">python-oracledb</w:t>
-      </w:r>
-      <w:r>
-        <w:rPr>
-          <w:lang w:val="es-CO"/>
-        </w:rPr>
-        <w:t xml:space="preserve"> </w:t>
-      </w:r>
-      <w:r>
-        <w:rPr>
-          <w:lang w:val="es-CO"/>
-        </w:rPr>
-        <w:t xml:space="preserve">en modo Thin. La selección detallada del motor corresponde al análisis de RDBMS de esta fase.</w:t>
+        <w:t xml:space="preserve">. La conectividad desde la aplicación se realizará mediante JDBC con el controlador Thin de Oracle. La selección detallada del motor corresponde al análisis de RDBMS de esta fase.</w:t>
       </w:r>
     </w:p>
     <w:p>
@@ -1479,7 +1454,7 @@
         <w:rPr>
           <w:lang w:val="es-CO"/>
         </w:rPr>
-        <w:t xml:space="preserve">, integración con Python y mecanismos como AppArmor; es apropiada para PostgreSQL, MySQL y otros motores con paquetes compatibles.</w:t>
+        <w:t xml:space="preserve">, integración con Java y mecanismos como AppArmor; es apropiada para PostgreSQL, MySQL y otros motores con paquetes compatibles.</w:t>
       </w:r>
       <w:r>
         <w:rPr>
@@ -1564,7 +1539,7 @@
         <w:rPr>
           <w:lang w:val="es-CO"/>
         </w:rPr>
-        <w:t xml:space="preserve">instalación mínima de bajo consumo, estabilidad, repositorios amplios y documentación consolidada; facilita desplegar motores libres y aplicaciones Python.</w:t>
+        <w:t xml:space="preserve">instalación mínima de bajo consumo, estabilidad, repositorios amplios y documentación consolidada; facilita desplegar motores libres y aplicaciones Java.</w:t>
       </w:r>
       <w:r>
         <w:rPr>

</xml_diff>

<commit_message>
docs: documento final, presentacion de sustentacion y procedimiento del servidor
</commit_message>
<xml_diff>
--- a/documentos/fase2/01_Analisis_Seleccion_SO.docx
+++ b/documentos/fase2/01_Analisis_Seleccion_SO.docx
@@ -912,19 +912,19 @@
           <w:bCs/>
           <w:lang w:val="es-CO"/>
         </w:rPr>
-        <w:t xml:space="preserve">Oracle VirtualBox 7</w:t>
-      </w:r>
-      <w:r>
-        <w:rPr>
-          <w:lang w:val="es-CO"/>
-        </w:rPr>
-        <w:t xml:space="preserve"> </w:t>
-      </w:r>
-      <w:r>
-        <w:rPr>
-          <w:lang w:val="es-CO"/>
-        </w:rPr>
-        <w:t xml:space="preserve">en el computador del equipo que funcionará como servidor durante la demostración (Windows o Linux sobre x86_64). La simulación en macOS usa</w:t>
+        <w:t xml:space="preserve">KVM/QEMU</w:t>
+      </w:r>
+      <w:r>
+        <w:rPr>
+          <w:lang w:val="es-CO"/>
+        </w:rPr>
+        <w:t xml:space="preserve"> </w:t>
+      </w:r>
+      <w:r>
+        <w:rPr>
+          <w:lang w:val="es-CO"/>
+        </w:rPr>
+        <w:t xml:space="preserve">(por medio de Lima) en el computador del equipo que funcionará como servidor durante la demostración, un Lenovo con Linux sobre x86_64; en un anfitrión con Windows la alternativa es</w:t>
       </w:r>
       <w:r>
         <w:rPr>
@@ -938,6 +938,26 @@
           <w:bCs/>
           <w:lang w:val="es-CO"/>
         </w:rPr>
+        <w:t xml:space="preserve">Oracle VirtualBox 7</w:t>
+      </w:r>
+      <w:r>
+        <w:rPr>
+          <w:lang w:val="es-CO"/>
+        </w:rPr>
+        <w:t xml:space="preserve">. La simulación en macOS usa</w:t>
+      </w:r>
+      <w:r>
+        <w:rPr>
+          <w:lang w:val="es-CO"/>
+        </w:rPr>
+        <w:t xml:space="preserve"> </w:t>
+      </w:r>
+      <w:r>
+        <w:rPr>
+          <w:b/>
+          <w:bCs/>
+          <w:lang w:val="es-CO"/>
+        </w:rPr>
         <w:t xml:space="preserve">Lima 2.2.1 y Apple Virtualization.framework</w:t>
       </w:r>
       <w:r>
@@ -999,7 +1019,7 @@
         <w:rPr>
           <w:lang w:val="es-CO"/>
         </w:rPr>
-        <w:t xml:space="preserve">Lima permite conservar una configuración declarativa para la simulación disponible. VirtualBox se mantiene como plataforma de la entrega en el equipo servidor. La elección del hipervisor depende del anfitrión y no cambia la selección de Linux como sistema invitado. [2, 3]</w:t>
+        <w:t xml:space="preserve">Lima permite conservar una configuración declarativa para la simulación disponible. En el equipo servidor con Linux se usa el hipervisor del propio kernel (KVM), sin instalar software de terceros. La elección del hipervisor depende del anfitrión y no cambia la selección de Linux como sistema invitado. [2, 3]</w:t>
       </w:r>
     </w:p>
     <w:p>
@@ -4001,7 +4021,7 @@
                 <w:sz w:val="19"/>
                 <w:lang w:val="es-CO"/>
               </w:rPr>
-              <w:t xml:space="preserve">Diferencias entre Lima en macOS y VirtualBox en el servidor</w:t>
+              <w:t xml:space="preserve">Diferencias entre la simulación en macOS (vz) y el servidor con Linux (KVM)</w:t>
             </w:r>
           </w:p>
         </w:tc>

</xml_diff>